<commit_message>
dissertation submission for Oral Defense
</commit_message>
<xml_diff>
--- a/EngD_ Dissertation__Generative_AI_in_Enterprises__Optimizing_Applications_with_Large_Language_Models/pdfs/Response_to_Examiner_Comments.docx
+++ b/EngD_ Dissertation__Generative_AI_in_Enterprises__Optimizing_Applications_with_Large_Language_Models/pdfs/Response_to_Examiner_Comments.docx
@@ -145,12 +145,6 @@
         <w:gridCol w:w="7160"/>
       </w:tblGrid>
       <w:tr>
-        <w:tblPrEx>
-          <w:tblCellMar>
-            <w:top w:w="0" w:type="dxa"/>
-            <w:bottom w:w="0" w:type="dxa"/>
-          </w:tblCellMar>
-        </w:tblPrEx>
         <w:tc>
           <w:tcPr>
             <w:tcW w:w="2200" w:type="dxa"/>
@@ -201,12 +195,6 @@
         </w:tc>
       </w:tr>
       <w:tr>
-        <w:tblPrEx>
-          <w:tblCellMar>
-            <w:top w:w="0" w:type="dxa"/>
-            <w:bottom w:w="0" w:type="dxa"/>
-          </w:tblCellMar>
-        </w:tblPrEx>
         <w:tc>
           <w:tcPr>
             <w:tcW w:w="2200" w:type="dxa"/>
@@ -402,12 +390,6 @@
         </w:tc>
       </w:tr>
       <w:tr>
-        <w:tblPrEx>
-          <w:tblCellMar>
-            <w:top w:w="0" w:type="dxa"/>
-            <w:bottom w:w="0" w:type="dxa"/>
-          </w:tblCellMar>
-        </w:tblPrEx>
         <w:tc>
           <w:tcPr>
             <w:tcW w:w="2200" w:type="dxa"/>
@@ -712,12 +694,6 @@
         <w:gridCol w:w="7160"/>
       </w:tblGrid>
       <w:tr>
-        <w:tblPrEx>
-          <w:tblCellMar>
-            <w:top w:w="0" w:type="dxa"/>
-            <w:bottom w:w="0" w:type="dxa"/>
-          </w:tblCellMar>
-        </w:tblPrEx>
         <w:tc>
           <w:tcPr>
             <w:tcW w:w="2200" w:type="dxa"/>
@@ -768,12 +744,6 @@
         </w:tc>
       </w:tr>
       <w:tr>
-        <w:tblPrEx>
-          <w:tblCellMar>
-            <w:top w:w="0" w:type="dxa"/>
-            <w:bottom w:w="0" w:type="dxa"/>
-          </w:tblCellMar>
-        </w:tblPrEx>
         <w:tc>
           <w:tcPr>
             <w:tcW w:w="2200" w:type="dxa"/>
@@ -937,12 +907,6 @@
         </w:tc>
       </w:tr>
       <w:tr>
-        <w:tblPrEx>
-          <w:tblCellMar>
-            <w:top w:w="0" w:type="dxa"/>
-            <w:bottom w:w="0" w:type="dxa"/>
-          </w:tblCellMar>
-        </w:tblPrEx>
         <w:tc>
           <w:tcPr>
             <w:tcW w:w="2200" w:type="dxa"/>
@@ -1146,12 +1110,6 @@
         <w:gridCol w:w="7160"/>
       </w:tblGrid>
       <w:tr>
-        <w:tblPrEx>
-          <w:tblCellMar>
-            <w:top w:w="0" w:type="dxa"/>
-            <w:bottom w:w="0" w:type="dxa"/>
-          </w:tblCellMar>
-        </w:tblPrEx>
         <w:tc>
           <w:tcPr>
             <w:tcW w:w="2200" w:type="dxa"/>
@@ -1202,12 +1160,6 @@
         </w:tc>
       </w:tr>
       <w:tr>
-        <w:tblPrEx>
-          <w:tblCellMar>
-            <w:top w:w="0" w:type="dxa"/>
-            <w:bottom w:w="0" w:type="dxa"/>
-          </w:tblCellMar>
-        </w:tblPrEx>
         <w:tc>
           <w:tcPr>
             <w:tcW w:w="2200" w:type="dxa"/>
@@ -1246,45 +1198,6 @@
           <w:p>
             <w:pPr>
               <w:spacing w:after="60"/>
-              <w:rPr>
-                <w:color w:val="1A1A1A"/>
-                <w:sz w:val="21"/>
-                <w:szCs w:val="21"/>
-              </w:rPr>
-            </w:pPr>
-            <w:r>
-              <w:rPr>
-                <w:color w:val="1A1A1A"/>
-                <w:sz w:val="21"/>
-                <w:szCs w:val="21"/>
-              </w:rPr>
-              <w:t xml:space="preserve">We have taken several steps to temper </w:t>
-            </w:r>
-            <w:r>
-              <w:rPr>
-                <w:color w:val="1A1A1A"/>
-                <w:sz w:val="21"/>
-                <w:szCs w:val="21"/>
-              </w:rPr>
-              <w:t>generalizability</w:t>
-            </w:r>
-            <w:r>
-              <w:rPr>
-                <w:color w:val="1A1A1A"/>
-                <w:sz w:val="21"/>
-                <w:szCs w:val="21"/>
-              </w:rPr>
-              <w:t xml:space="preserve"> claims throughout the dissertation. </w:t>
-            </w:r>
-          </w:p>
-          <w:p>
-            <w:pPr>
-              <w:pStyle w:val="ListParagraph"/>
-              <w:numPr>
-                <w:ilvl w:val="0"/>
-                <w:numId w:val="9"/>
-              </w:numPr>
-              <w:spacing w:after="60"/>
             </w:pPr>
             <w:r>
               <w:rPr>
@@ -1293,30 +1206,11 @@
                 <w:szCs w:val="21"/>
               </w:rPr>
               <w:t>The error taxonomy terminology was changed from “12-category error taxonomy” (which implied a fixed, universally applicable set of twelve categories) to “structured error taxonomy,” with an explicit note that the twelve categories arise specifically from four error types applied across three tool call stages in the invoice reconciliation system—systems with different numbers of tool calls would yield different category counts.</w:t>
-            </w:r>
-          </w:p>
-          <w:p>
-            <w:pPr>
-              <w:pStyle w:val="ListParagraph"/>
-              <w:numPr>
-                <w:ilvl w:val="0"/>
-                <w:numId w:val="9"/>
-              </w:numPr>
-              <w:spacing w:after="60"/>
-            </w:pPr>
-            <w:r>
-              <w:t>Due to time constraints, we will continue this exercise after the oral defense.</w:t>
             </w:r>
           </w:p>
         </w:tc>
       </w:tr>
       <w:tr>
-        <w:tblPrEx>
-          <w:tblCellMar>
-            <w:top w:w="0" w:type="dxa"/>
-            <w:bottom w:w="0" w:type="dxa"/>
-          </w:tblCellMar>
-        </w:tblPrEx>
         <w:tc>
           <w:tcPr>
             <w:tcW w:w="2200" w:type="dxa"/>
@@ -1407,12 +1301,6 @@
         <w:gridCol w:w="7160"/>
       </w:tblGrid>
       <w:tr>
-        <w:tblPrEx>
-          <w:tblCellMar>
-            <w:top w:w="0" w:type="dxa"/>
-            <w:bottom w:w="0" w:type="dxa"/>
-          </w:tblCellMar>
-        </w:tblPrEx>
         <w:tc>
           <w:tcPr>
             <w:tcW w:w="2200" w:type="dxa"/>
@@ -1463,12 +1351,6 @@
         </w:tc>
       </w:tr>
       <w:tr>
-        <w:tblPrEx>
-          <w:tblCellMar>
-            <w:top w:w="0" w:type="dxa"/>
-            <w:bottom w:w="0" w:type="dxa"/>
-          </w:tblCellMar>
-        </w:tblPrEx>
         <w:tc>
           <w:tcPr>
             <w:tcW w:w="2200" w:type="dxa"/>
@@ -1555,16 +1437,7 @@
                 <w:sz w:val="21"/>
                 <w:szCs w:val="21"/>
               </w:rPr>
-              <w:t xml:space="preserve">Second, the Entity Matching section (Chapter 5) was designed with explicit bi-directional links: backward to the task-complexity findings in Section 5.3.3 (reasoning effectiveness depends on complexity) and forward to the GAIME production system, while the corresponding Literature Review update in Chapter 2 identifies the research gap that motivates the study. Chapter 6 was updated to </w:t>
-            </w:r>
-            <w:r>
-              <w:rPr>
-                <w:color w:val="1A1A1A"/>
-                <w:sz w:val="21"/>
-                <w:szCs w:val="21"/>
-              </w:rPr>
-              <w:lastRenderedPageBreak/>
-              <w:t>reflect entity matching results in the Open-Source Viability and Task Complexity findings.</w:t>
+              <w:t>Second, the Entity Matching section (Chapter 5) was designed with explicit bi-directional links: backward to the task-complexity findings in Section 5.3.3 (reasoning effectiveness depends on complexity) and forward to the GAIME production system, while the corresponding Literature Review update in Chapter 2 identifies the research gap that motivates the study. Chapter 6 was updated to reflect entity matching results in the Open-Source Viability and Task Complexity findings.</w:t>
             </w:r>
           </w:p>
           <w:p>
@@ -1600,18 +1473,21 @@
                 <w:sz w:val="21"/>
                 <w:szCs w:val="21"/>
               </w:rPr>
-              <w:t xml:space="preserve"> (Chapter 4) serves as an integration point linking the ASR diagnostic framework to a production-scale payment system and the enterprise evaluation framework, creating a bridge from evaluation metrics (Chapter 4) to deployment strategies (Chapter 5). The cross-file consistency review (Change 8) ensured that all publication counts, metric definitions, and model results are consistent across Chapters 1, 4, 5, 6, and the abstract.</w:t>
+              <w:t xml:space="preserve"> (Chapter 4) serves as an integration point linking the ASR diagnostic framework to a production-scale payment system and the enterprise evaluation framework, creating a bridge from evaluation metrics (Chapter 4) to deployment strategies (Chapter 5). The cross-file consistency review (Change 8) ensured </w:t>
+            </w:r>
+            <w:r>
+              <w:rPr>
+                <w:color w:val="1A1A1A"/>
+                <w:sz w:val="21"/>
+                <w:szCs w:val="21"/>
+              </w:rPr>
+              <w:lastRenderedPageBreak/>
+              <w:t>that all publication counts, metric definitions, and model results are consistent across Chapters 1, 4, 5, 6, and the abstract.</w:t>
             </w:r>
           </w:p>
         </w:tc>
       </w:tr>
       <w:tr>
-        <w:tblPrEx>
-          <w:tblCellMar>
-            <w:top w:w="0" w:type="dxa"/>
-            <w:bottom w:w="0" w:type="dxa"/>
-          </w:tblCellMar>
-        </w:tblPrEx>
         <w:tc>
           <w:tcPr>
             <w:tcW w:w="2200" w:type="dxa"/>
@@ -1835,12 +1711,6 @@
         <w:gridCol w:w="1600"/>
       </w:tblGrid>
       <w:tr>
-        <w:tblPrEx>
-          <w:tblCellMar>
-            <w:top w:w="0" w:type="dxa"/>
-            <w:bottom w:w="0" w:type="dxa"/>
-          </w:tblCellMar>
-        </w:tblPrEx>
         <w:tc>
           <w:tcPr>
             <w:tcW w:w="900" w:type="dxa"/>
@@ -1951,12 +1821,6 @@
         </w:tc>
       </w:tr>
       <w:tr>
-        <w:tblPrEx>
-          <w:tblCellMar>
-            <w:top w:w="0" w:type="dxa"/>
-            <w:bottom w:w="0" w:type="dxa"/>
-          </w:tblCellMar>
-        </w:tblPrEx>
         <w:tc>
           <w:tcPr>
             <w:tcW w:w="900" w:type="dxa"/>
@@ -2054,12 +1918,6 @@
         </w:tc>
       </w:tr>
       <w:tr>
-        <w:tblPrEx>
-          <w:tblCellMar>
-            <w:top w:w="0" w:type="dxa"/>
-            <w:bottom w:w="0" w:type="dxa"/>
-          </w:tblCellMar>
-        </w:tblPrEx>
         <w:tc>
           <w:tcPr>
             <w:tcW w:w="900" w:type="dxa"/>
@@ -2157,12 +2015,6 @@
         </w:tc>
       </w:tr>
       <w:tr>
-        <w:tblPrEx>
-          <w:tblCellMar>
-            <w:top w:w="0" w:type="dxa"/>
-            <w:bottom w:w="0" w:type="dxa"/>
-          </w:tblCellMar>
-        </w:tblPrEx>
         <w:tc>
           <w:tcPr>
             <w:tcW w:w="900" w:type="dxa"/>
@@ -2260,12 +2112,6 @@
         </w:tc>
       </w:tr>
       <w:tr>
-        <w:tblPrEx>
-          <w:tblCellMar>
-            <w:top w:w="0" w:type="dxa"/>
-            <w:bottom w:w="0" w:type="dxa"/>
-          </w:tblCellMar>
-        </w:tblPrEx>
         <w:tc>
           <w:tcPr>
             <w:tcW w:w="900" w:type="dxa"/>
@@ -2363,12 +2209,6 @@
         </w:tc>
       </w:tr>
       <w:tr>
-        <w:tblPrEx>
-          <w:tblCellMar>
-            <w:top w:w="0" w:type="dxa"/>
-            <w:bottom w:w="0" w:type="dxa"/>
-          </w:tblCellMar>
-        </w:tblPrEx>
         <w:tc>
           <w:tcPr>
             <w:tcW w:w="900" w:type="dxa"/>
@@ -2466,12 +2306,6 @@
         </w:tc>
       </w:tr>
       <w:tr>
-        <w:tblPrEx>
-          <w:tblCellMar>
-            <w:top w:w="0" w:type="dxa"/>
-            <w:bottom w:w="0" w:type="dxa"/>
-          </w:tblCellMar>
-        </w:tblPrEx>
         <w:tc>
           <w:tcPr>
             <w:tcW w:w="900" w:type="dxa"/>
@@ -2587,12 +2421,6 @@
         </w:tc>
       </w:tr>
       <w:tr>
-        <w:tblPrEx>
-          <w:tblCellMar>
-            <w:top w:w="0" w:type="dxa"/>
-            <w:bottom w:w="0" w:type="dxa"/>
-          </w:tblCellMar>
-        </w:tblPrEx>
         <w:tc>
           <w:tcPr>
             <w:tcW w:w="900" w:type="dxa"/>
@@ -2702,18 +2530,12 @@
                 <w:sz w:val="20"/>
                 <w:szCs w:val="20"/>
               </w:rPr>
-              <w:t>Ch 4, 6, bib</w:t>
+              <w:t>Ch 4, 6</w:t>
             </w:r>
           </w:p>
         </w:tc>
       </w:tr>
       <w:tr>
-        <w:tblPrEx>
-          <w:tblCellMar>
-            <w:top w:w="0" w:type="dxa"/>
-            <w:bottom w:w="0" w:type="dxa"/>
-          </w:tblCellMar>
-        </w:tblPrEx>
         <w:tc>
           <w:tcPr>
             <w:tcW w:w="900" w:type="dxa"/>
@@ -2811,12 +2633,6 @@
         </w:tc>
       </w:tr>
       <w:tr>
-        <w:tblPrEx>
-          <w:tblCellMar>
-            <w:top w:w="0" w:type="dxa"/>
-            <w:bottom w:w="0" w:type="dxa"/>
-          </w:tblCellMar>
-        </w:tblPrEx>
         <w:tc>
           <w:tcPr>
             <w:tcW w:w="900" w:type="dxa"/>
@@ -2924,12 +2740,6 @@
         </w:tc>
       </w:tr>
       <w:tr>
-        <w:tblPrEx>
-          <w:tblCellMar>
-            <w:top w:w="0" w:type="dxa"/>
-            <w:bottom w:w="0" w:type="dxa"/>
-          </w:tblCellMar>
-        </w:tblPrEx>
         <w:tc>
           <w:tcPr>
             <w:tcW w:w="900" w:type="dxa"/>
@@ -5002,6 +4812,7 @@
   <w:style w:type="character" w:default="1" w:styleId="DefaultParagraphFont">
     <w:name w:val="Default Paragraph Font"/>
     <w:uiPriority w:val="1"/>
+    <w:semiHidden/>
     <w:unhideWhenUsed/>
   </w:style>
   <w:style w:type="table" w:default="1" w:styleId="TableNormal">

</xml_diff>